<commit_message>
updated K puff+ summary
</commit_message>
<xml_diff>
--- a/summary of K puff analysis - 20251209.docx
+++ b/summary of K puff analysis - 20251209.docx
@@ -57,18 +57,10 @@
           <w:noProof/>
         </w:rPr>
         <w:drawing>
-          <wp:anchor distT="0" distB="0" distL="114300" distR="114300" simplePos="0" relativeHeight="251660288" behindDoc="0" locked="0" layoutInCell="1" allowOverlap="1" wp14:anchorId="5C2631D9" wp14:editId="0A9AB5CC">
-            <wp:simplePos x="0" y="0"/>
-            <wp:positionH relativeFrom="column">
-              <wp:posOffset>0</wp:posOffset>
-            </wp:positionH>
-            <wp:positionV relativeFrom="paragraph">
-              <wp:posOffset>3086</wp:posOffset>
-            </wp:positionV>
-            <wp:extent cx="3890855" cy="1360968"/>
+          <wp:inline distT="0" distB="0" distL="0" distR="0" wp14:anchorId="0095F315" wp14:editId="267E1306">
+            <wp:extent cx="4039141" cy="1414131"/>
             <wp:effectExtent l="0" t="0" r="0" b="0"/>
-            <wp:wrapTopAndBottom/>
-            <wp:docPr id="929067686" name="Picture 1" descr="A graph with purple lines&#10;&#10;AI-generated content may be incorrect."/>
+            <wp:docPr id="1467550616" name="Picture 1" descr="A graph with purple lines&#10;&#10;AI-generated content may be incorrect."/>
             <wp:cNvGraphicFramePr>
               <a:graphicFrameLocks xmlns:a="http://schemas.openxmlformats.org/drawingml/2006/main" noChangeAspect="1"/>
             </wp:cNvGraphicFramePr>
@@ -76,7 +68,7 @@
               <a:graphicData uri="http://schemas.openxmlformats.org/drawingml/2006/picture">
                 <pic:pic xmlns:pic="http://schemas.openxmlformats.org/drawingml/2006/picture">
                   <pic:nvPicPr>
-                    <pic:cNvPr id="929067686" name="Picture 1" descr="A graph with purple lines&#10;&#10;AI-generated content may be incorrect."/>
+                    <pic:cNvPr id="1467550616" name="Picture 1" descr="A graph with purple lines&#10;&#10;AI-generated content may be incorrect."/>
                     <pic:cNvPicPr>
                       <a:picLocks noChangeAspect="1" noChangeArrowheads="1"/>
                     </pic:cNvPicPr>
@@ -97,7 +89,7 @@
                   <pic:spPr bwMode="auto">
                     <a:xfrm>
                       <a:off x="0" y="0"/>
-                      <a:ext cx="3890855" cy="1360968"/>
+                      <a:ext cx="4049008" cy="1417586"/>
                     </a:xfrm>
                     <a:prstGeom prst="rect">
                       <a:avLst/>
@@ -110,7 +102,7 @@
                 </pic:pic>
               </a:graphicData>
             </a:graphic>
-          </wp:anchor>
+          </wp:inline>
         </w:drawing>
       </w:r>
     </w:p>
@@ -125,18 +117,10 @@
           <w:noProof/>
         </w:rPr>
         <w:drawing>
-          <wp:anchor distT="0" distB="0" distL="114300" distR="114300" simplePos="0" relativeHeight="251659264" behindDoc="0" locked="0" layoutInCell="1" allowOverlap="1" wp14:anchorId="4335FAE9" wp14:editId="331449D7">
-            <wp:simplePos x="0" y="0"/>
-            <wp:positionH relativeFrom="column">
-              <wp:posOffset>0</wp:posOffset>
-            </wp:positionH>
-            <wp:positionV relativeFrom="paragraph">
-              <wp:posOffset>-605</wp:posOffset>
-            </wp:positionV>
-            <wp:extent cx="3574488" cy="2076716"/>
-            <wp:effectExtent l="0" t="0" r="6985" b="0"/>
-            <wp:wrapTopAndBottom/>
-            <wp:docPr id="194094725" name="Picture 2" descr="A screenshot of a graph&#10;&#10;AI-generated content may be incorrect."/>
+          <wp:inline distT="0" distB="0" distL="0" distR="0" wp14:anchorId="2452DE9E" wp14:editId="72533E17">
+            <wp:extent cx="3930636" cy="2264735"/>
+            <wp:effectExtent l="0" t="0" r="0" b="2540"/>
+            <wp:docPr id="1422788845" name="Picture 2" descr="A screenshot of a graph&#10;&#10;AI-generated content may be incorrect."/>
             <wp:cNvGraphicFramePr>
               <a:graphicFrameLocks xmlns:a="http://schemas.openxmlformats.org/drawingml/2006/main" noChangeAspect="1"/>
             </wp:cNvGraphicFramePr>
@@ -144,7 +128,7 @@
               <a:graphicData uri="http://schemas.openxmlformats.org/drawingml/2006/picture">
                 <pic:pic xmlns:pic="http://schemas.openxmlformats.org/drawingml/2006/picture">
                   <pic:nvPicPr>
-                    <pic:cNvPr id="194094725" name="Picture 2" descr="A screenshot of a graph&#10;&#10;AI-generated content may be incorrect."/>
+                    <pic:cNvPr id="1422788845" name="Picture 2" descr="A screenshot of a graph&#10;&#10;AI-generated content may be incorrect."/>
                     <pic:cNvPicPr>
                       <a:picLocks noChangeAspect="1" noChangeArrowheads="1"/>
                     </pic:cNvPicPr>
@@ -165,7 +149,7 @@
                   <pic:spPr bwMode="auto">
                     <a:xfrm>
                       <a:off x="0" y="0"/>
-                      <a:ext cx="3574488" cy="2076716"/>
+                      <a:ext cx="3935804" cy="2267713"/>
                     </a:xfrm>
                     <a:prstGeom prst="rect">
                       <a:avLst/>
@@ -178,7 +162,7 @@
                 </pic:pic>
               </a:graphicData>
             </a:graphic>
-          </wp:anchor>
+          </wp:inline>
         </w:drawing>
       </w:r>
     </w:p>
@@ -192,19 +176,67 @@
         <w:rPr>
           <w:noProof/>
         </w:rPr>
+        <w:t xml:space="preserve">Then construct </w:t>
+      </w:r>
+      <w:r>
+        <w:rPr>
+          <w:noProof/>
+        </w:rPr>
+        <w:t>puff-</w:t>
+      </w:r>
+      <w:r>
+        <w:rPr>
+          <w:noProof/>
+        </w:rPr>
+        <w:t xml:space="preserve">triggered averages. To compare </w:t>
+      </w:r>
+      <w:r>
+        <w:rPr>
+          <w:noProof/>
+        </w:rPr>
+        <w:t>puff</w:t>
+      </w:r>
+      <w:r>
+        <w:rPr>
+          <w:noProof/>
+        </w:rPr>
+        <w:t xml:space="preserve">-triggered nIRCat signal to random fluctuations, shuffle the data (n=100 shuffles of k = (number of actual </w:t>
+      </w:r>
+      <w:r>
+        <w:rPr>
+          <w:noProof/>
+        </w:rPr>
+        <w:t>puffs</w:t>
+      </w:r>
+      <w:r>
+        <w:rPr>
+          <w:noProof/>
+        </w:rPr>
+        <w:t>) random trigger frames). Measure average of three frames around peak of nIRCat signal in the 10 second pre- and post-</w:t>
+      </w:r>
+      <w:r>
+        <w:rPr>
+          <w:noProof/>
+        </w:rPr>
+        <w:t xml:space="preserve">puff </w:t>
+      </w:r>
+      <w:r>
+        <w:rPr>
+          <w:noProof/>
+        </w:rPr>
+        <w:t xml:space="preserve">windows. </w:t>
+      </w:r>
+    </w:p>
+    <w:p>
+      <w:r>
+        <w:rPr>
+          <w:noProof/>
+        </w:rPr>
         <w:drawing>
-          <wp:anchor distT="0" distB="0" distL="114300" distR="114300" simplePos="0" relativeHeight="251658240" behindDoc="0" locked="0" layoutInCell="1" allowOverlap="1" wp14:anchorId="35E19EF9" wp14:editId="3EF75F6A">
-            <wp:simplePos x="0" y="0"/>
-            <wp:positionH relativeFrom="margin">
-              <wp:align>left</wp:align>
-            </wp:positionH>
-            <wp:positionV relativeFrom="paragraph">
-              <wp:posOffset>871500</wp:posOffset>
-            </wp:positionV>
-            <wp:extent cx="4022090" cy="2113915"/>
-            <wp:effectExtent l="0" t="0" r="0" b="635"/>
-            <wp:wrapTopAndBottom/>
-            <wp:docPr id="1189278015" name="Picture 4" descr="A graph of a graph of a graph&#10;&#10;AI-generated content may be incorrect."/>
+          <wp:inline distT="0" distB="0" distL="0" distR="0" wp14:anchorId="4B5AC560" wp14:editId="186B9581">
+            <wp:extent cx="4038600" cy="2105594"/>
+            <wp:effectExtent l="0" t="0" r="0" b="9525"/>
+            <wp:docPr id="421388999" name="Picture 3" descr="A screenshot of a graph&#10;&#10;AI-generated content may be incorrect."/>
             <wp:cNvGraphicFramePr>
               <a:graphicFrameLocks xmlns:a="http://schemas.openxmlformats.org/drawingml/2006/main" noChangeAspect="1"/>
             </wp:cNvGraphicFramePr>
@@ -212,7 +244,7 @@
               <a:graphicData uri="http://schemas.openxmlformats.org/drawingml/2006/picture">
                 <pic:pic xmlns:pic="http://schemas.openxmlformats.org/drawingml/2006/picture">
                   <pic:nvPicPr>
-                    <pic:cNvPr id="1189278015" name="Picture 4" descr="A graph of a graph of a graph&#10;&#10;AI-generated content may be incorrect."/>
+                    <pic:cNvPr id="421388999" name="Picture 3" descr="A screenshot of a graph&#10;&#10;AI-generated content may be incorrect."/>
                     <pic:cNvPicPr>
                       <a:picLocks noChangeAspect="1" noChangeArrowheads="1"/>
                     </pic:cNvPicPr>
@@ -233,7 +265,7 @@
                   <pic:spPr bwMode="auto">
                     <a:xfrm>
                       <a:off x="0" y="0"/>
-                      <a:ext cx="4022090" cy="2113915"/>
+                      <a:ext cx="4055522" cy="2114416"/>
                     </a:xfrm>
                     <a:prstGeom prst="rect">
                       <a:avLst/>
@@ -246,102 +278,36 @@
                 </pic:pic>
               </a:graphicData>
             </a:graphic>
-          </wp:anchor>
+          </wp:inline>
         </w:drawing>
       </w:r>
-      <w:r>
-        <w:rPr>
-          <w:noProof/>
-        </w:rPr>
-        <w:t xml:space="preserve">Then construct </w:t>
-      </w:r>
-      <w:r>
-        <w:rPr>
-          <w:noProof/>
-        </w:rPr>
-        <w:t>puff-</w:t>
-      </w:r>
-      <w:r>
-        <w:rPr>
-          <w:noProof/>
-        </w:rPr>
-        <w:t xml:space="preserve">triggered averages. To compare </w:t>
-      </w:r>
-      <w:r>
-        <w:rPr>
-          <w:noProof/>
-        </w:rPr>
-        <w:t>puff</w:t>
-      </w:r>
-      <w:r>
-        <w:rPr>
-          <w:noProof/>
-        </w:rPr>
-        <w:t xml:space="preserve">-triggered nIRCat signal to random fluctuations, shuffle the data (n=100 shuffles of k = (number of actual </w:t>
-      </w:r>
-      <w:r>
-        <w:rPr>
-          <w:noProof/>
-        </w:rPr>
-        <w:t>puffs</w:t>
-      </w:r>
-      <w:r>
-        <w:rPr>
-          <w:noProof/>
-        </w:rPr>
-        <w:t>) random trigger frames). Measure average of three frames around peak of nIRCat signal in the 10 second pre- and post-</w:t>
-      </w:r>
-      <w:r>
-        <w:rPr>
-          <w:noProof/>
-        </w:rPr>
-        <w:t xml:space="preserve">puff </w:t>
-      </w:r>
-      <w:r>
-        <w:rPr>
-          <w:noProof/>
-        </w:rPr>
-        <w:t xml:space="preserve">windows. </w:t>
-      </w:r>
-    </w:p>
-    <w:p/>
-    <w:p>
-      <w:r>
+    </w:p>
+    <w:p>
+      <w:pPr>
         <w:rPr>
           <w:b/>
           <w:bCs/>
         </w:rPr>
-        <w:t>Negative controls:</w:t>
-      </w:r>
-      <w:r>
-        <w:t xml:space="preserve"> two trials from one mouse puffing ACSF on the sensor and one trial puffing K+ on SWCNT without the single stranded DNA that confers DA sensitivity. </w:t>
-      </w:r>
-    </w:p>
-    <w:p>
-      <w:pPr>
+      </w:pPr>
+      <w:r>
+        <w:rPr>
+          <w:b/>
+          <w:bCs/>
+        </w:rPr>
+        <w:lastRenderedPageBreak/>
+        <w:t>More example:</w:t>
+      </w:r>
+    </w:p>
+    <w:p>
+      <w:r>
         <w:rPr>
           <w:noProof/>
         </w:rPr>
-      </w:pPr>
-    </w:p>
-    <w:p>
-      <w:r>
-        <w:rPr>
-          <w:noProof/>
-        </w:rPr>
-        <w:t xml:space="preserve">K+ puffs onto bare SWCNT: </w:t>
-      </w:r>
-    </w:p>
-    <w:p>
-      <w:r>
-        <w:rPr>
-          <w:noProof/>
-        </w:rPr>
         <w:drawing>
-          <wp:inline distT="0" distB="0" distL="0" distR="0" wp14:anchorId="74D41221" wp14:editId="1E00DD11">
-            <wp:extent cx="5943600" cy="3070225"/>
+          <wp:inline distT="0" distB="0" distL="0" distR="0" wp14:anchorId="333D4178" wp14:editId="091A349B">
+            <wp:extent cx="5943600" cy="3127375"/>
             <wp:effectExtent l="0" t="0" r="0" b="0"/>
-            <wp:docPr id="986558670" name="Picture 5" descr="A graph of a graph of a graph&#10;&#10;AI-generated content may be incorrect."/>
+            <wp:docPr id="804468063" name="Picture 5" descr="A graph of a graph of a graph&#10;&#10;AI-generated content may be incorrect."/>
             <wp:cNvGraphicFramePr>
               <a:graphicFrameLocks xmlns:a="http://schemas.openxmlformats.org/drawingml/2006/main" noChangeAspect="1"/>
             </wp:cNvGraphicFramePr>
@@ -349,7 +315,7 @@
               <a:graphicData uri="http://schemas.openxmlformats.org/drawingml/2006/picture">
                 <pic:pic xmlns:pic="http://schemas.openxmlformats.org/drawingml/2006/picture">
                   <pic:nvPicPr>
-                    <pic:cNvPr id="986558670" name="Picture 5" descr="A graph of a graph of a graph&#10;&#10;AI-generated content may be incorrect."/>
+                    <pic:cNvPr id="804468063" name="Picture 5" descr="A graph of a graph of a graph&#10;&#10;AI-generated content may be incorrect."/>
                     <pic:cNvPicPr>
                       <a:picLocks noChangeAspect="1" noChangeArrowheads="1"/>
                     </pic:cNvPicPr>
@@ -370,7 +336,7 @@
                   <pic:spPr bwMode="auto">
                     <a:xfrm>
                       <a:off x="0" y="0"/>
-                      <a:ext cx="5943600" cy="3070225"/>
+                      <a:ext cx="5943600" cy="3127375"/>
                     </a:xfrm>
                     <a:prstGeom prst="rect">
                       <a:avLst/>
@@ -387,22 +353,16 @@
         </w:drawing>
       </w:r>
     </w:p>
-    <w:p/>
-    <w:p>
-      <w:r>
-        <w:t xml:space="preserve">ACSF puffs onto functional sensor: </w:t>
-      </w:r>
-    </w:p>
     <w:p>
       <w:r>
         <w:rPr>
           <w:noProof/>
         </w:rPr>
         <w:drawing>
-          <wp:inline distT="0" distB="0" distL="0" distR="0" wp14:anchorId="0486A574" wp14:editId="0D8F0102">
-            <wp:extent cx="5943600" cy="2795270"/>
-            <wp:effectExtent l="0" t="0" r="0" b="5080"/>
-            <wp:docPr id="1578182138" name="Picture 7" descr="A graph of different colored lines&#10;&#10;AI-generated content may be incorrect."/>
+          <wp:inline distT="0" distB="0" distL="0" distR="0" wp14:anchorId="7E01F9F1" wp14:editId="7DEAAABF">
+            <wp:extent cx="5943600" cy="3127375"/>
+            <wp:effectExtent l="0" t="0" r="0" b="0"/>
+            <wp:docPr id="689406349" name="Picture 6" descr="A graph of a graph of a graph&#10;&#10;AI-generated content may be incorrect."/>
             <wp:cNvGraphicFramePr>
               <a:graphicFrameLocks xmlns:a="http://schemas.openxmlformats.org/drawingml/2006/main" noChangeAspect="1"/>
             </wp:cNvGraphicFramePr>
@@ -410,7 +370,7 @@
               <a:graphicData uri="http://schemas.openxmlformats.org/drawingml/2006/picture">
                 <pic:pic xmlns:pic="http://schemas.openxmlformats.org/drawingml/2006/picture">
                   <pic:nvPicPr>
-                    <pic:cNvPr id="1578182138" name="Picture 7" descr="A graph of different colored lines&#10;&#10;AI-generated content may be incorrect."/>
+                    <pic:cNvPr id="689406349" name="Picture 6" descr="A graph of a graph of a graph&#10;&#10;AI-generated content may be incorrect."/>
                     <pic:cNvPicPr>
                       <a:picLocks noChangeAspect="1" noChangeArrowheads="1"/>
                     </pic:cNvPicPr>
@@ -431,7 +391,7 @@
                   <pic:spPr bwMode="auto">
                     <a:xfrm>
                       <a:off x="0" y="0"/>
-                      <a:ext cx="5943600" cy="2795270"/>
+                      <a:ext cx="5943600" cy="3127375"/>
                     </a:xfrm>
                     <a:prstGeom prst="rect">
                       <a:avLst/>
@@ -449,25 +409,22 @@
       </w:r>
     </w:p>
     <w:p/>
-    <w:p>
-      <w:pPr>
+    <w:p/>
+    <w:p/>
+    <w:p/>
+    <w:p/>
+    <w:p>
+      <w:r>
+        <w:t xml:space="preserve">Large, integrating responses to 2.5 M K+ puffs: </w:t>
+      </w:r>
+    </w:p>
+    <w:p>
+      <w:r>
         <w:rPr>
           <w:noProof/>
         </w:rPr>
-      </w:pPr>
-    </w:p>
-    <w:p>
-      <w:r>
-        <w:t xml:space="preserve">Large, integrating responses to 2.5 M K+ puffs: </w:t>
-      </w:r>
-    </w:p>
-    <w:p>
-      <w:r>
-        <w:rPr>
-          <w:noProof/>
-        </w:rPr>
         <w:drawing>
-          <wp:inline distT="0" distB="0" distL="0" distR="0" wp14:anchorId="6DCE9FD4" wp14:editId="238C1034">
+          <wp:inline distT="0" distB="0" distL="0" distR="0" wp14:anchorId="64589AB9" wp14:editId="3634AA96">
             <wp:extent cx="5943600" cy="3521075"/>
             <wp:effectExtent l="0" t="0" r="0" b="3175"/>
             <wp:docPr id="1341778003" name="Picture 8" descr="A screenshot of a computer screen&#10;&#10;AI-generated content may be incorrect."/>
@@ -518,8 +475,239 @@
     </w:p>
     <w:p/>
     <w:p/>
+    <w:p>
+      <w:pPr>
+        <w:rPr>
+          <w:b/>
+          <w:bCs/>
+        </w:rPr>
+      </w:pPr>
+    </w:p>
+    <w:p>
+      <w:pPr>
+        <w:rPr>
+          <w:b/>
+          <w:bCs/>
+        </w:rPr>
+      </w:pPr>
+    </w:p>
+    <w:p>
+      <w:pPr>
+        <w:rPr>
+          <w:b/>
+          <w:bCs/>
+        </w:rPr>
+      </w:pPr>
+    </w:p>
+    <w:p>
+      <w:pPr>
+        <w:rPr>
+          <w:b/>
+          <w:bCs/>
+        </w:rPr>
+      </w:pPr>
+    </w:p>
+    <w:p>
+      <w:pPr>
+        <w:rPr>
+          <w:b/>
+          <w:bCs/>
+        </w:rPr>
+      </w:pPr>
+    </w:p>
+    <w:p>
+      <w:pPr>
+        <w:rPr>
+          <w:b/>
+          <w:bCs/>
+        </w:rPr>
+      </w:pPr>
+    </w:p>
+    <w:p>
+      <w:pPr>
+        <w:rPr>
+          <w:b/>
+          <w:bCs/>
+        </w:rPr>
+      </w:pPr>
+    </w:p>
+    <w:p>
+      <w:pPr>
+        <w:rPr>
+          <w:b/>
+          <w:bCs/>
+        </w:rPr>
+      </w:pPr>
+    </w:p>
+    <w:p>
+      <w:pPr>
+        <w:rPr>
+          <w:b/>
+          <w:bCs/>
+        </w:rPr>
+      </w:pPr>
+    </w:p>
+    <w:p>
+      <w:pPr>
+        <w:rPr>
+          <w:b/>
+          <w:bCs/>
+        </w:rPr>
+      </w:pPr>
+    </w:p>
+    <w:p>
+      <w:pPr>
+        <w:rPr>
+          <w:b/>
+          <w:bCs/>
+        </w:rPr>
+      </w:pPr>
+    </w:p>
+    <w:p>
+      <w:r>
+        <w:rPr>
+          <w:b/>
+          <w:bCs/>
+        </w:rPr>
+        <w:t>Negative controls:</w:t>
+      </w:r>
+      <w:r>
+        <w:t xml:space="preserve"> two trials from one mouse puffing ACSF on the sensor and one trial puffing K+ on SWCNT without the single stranded DNA that confers DA sensitivity. </w:t>
+      </w:r>
+    </w:p>
+    <w:p>
+      <w:pPr>
+        <w:rPr>
+          <w:noProof/>
+        </w:rPr>
+      </w:pPr>
+    </w:p>
+    <w:p>
+      <w:r>
+        <w:rPr>
+          <w:noProof/>
+        </w:rPr>
+        <w:t xml:space="preserve">K+ puffs onto bare SWCNT: </w:t>
+      </w:r>
+    </w:p>
+    <w:p>
+      <w:r>
+        <w:rPr>
+          <w:noProof/>
+        </w:rPr>
+        <w:drawing>
+          <wp:inline distT="0" distB="0" distL="0" distR="0" wp14:anchorId="74D41221" wp14:editId="1E00DD11">
+            <wp:extent cx="5943600" cy="3070225"/>
+            <wp:effectExtent l="0" t="0" r="0" b="0"/>
+            <wp:docPr id="986558670" name="Picture 5" descr="A graph of a graph of a graph&#10;&#10;AI-generated content may be incorrect."/>
+            <wp:cNvGraphicFramePr>
+              <a:graphicFrameLocks xmlns:a="http://schemas.openxmlformats.org/drawingml/2006/main" noChangeAspect="1"/>
+            </wp:cNvGraphicFramePr>
+            <a:graphic xmlns:a="http://schemas.openxmlformats.org/drawingml/2006/main">
+              <a:graphicData uri="http://schemas.openxmlformats.org/drawingml/2006/picture">
+                <pic:pic xmlns:pic="http://schemas.openxmlformats.org/drawingml/2006/picture">
+                  <pic:nvPicPr>
+                    <pic:cNvPr id="986558670" name="Picture 5" descr="A graph of a graph of a graph&#10;&#10;AI-generated content may be incorrect."/>
+                    <pic:cNvPicPr>
+                      <a:picLocks noChangeAspect="1" noChangeArrowheads="1"/>
+                    </pic:cNvPicPr>
+                  </pic:nvPicPr>
+                  <pic:blipFill>
+                    <a:blip r:embed="rId12">
+                      <a:extLst>
+                        <a:ext uri="{28A0092B-C50C-407E-A947-70E740481C1C}">
+                          <a14:useLocalDpi xmlns:a14="http://schemas.microsoft.com/office/drawing/2010/main" val="0"/>
+                        </a:ext>
+                      </a:extLst>
+                    </a:blip>
+                    <a:srcRect/>
+                    <a:stretch>
+                      <a:fillRect/>
+                    </a:stretch>
+                  </pic:blipFill>
+                  <pic:spPr bwMode="auto">
+                    <a:xfrm>
+                      <a:off x="0" y="0"/>
+                      <a:ext cx="5943600" cy="3070225"/>
+                    </a:xfrm>
+                    <a:prstGeom prst="rect">
+                      <a:avLst/>
+                    </a:prstGeom>
+                    <a:noFill/>
+                    <a:ln>
+                      <a:noFill/>
+                    </a:ln>
+                  </pic:spPr>
+                </pic:pic>
+              </a:graphicData>
+            </a:graphic>
+          </wp:inline>
+        </w:drawing>
+      </w:r>
+    </w:p>
     <w:p/>
     <w:p>
+      <w:r>
+        <w:t xml:space="preserve">ACSF puffs onto functional sensor: </w:t>
+      </w:r>
+    </w:p>
+    <w:p>
+      <w:r>
+        <w:rPr>
+          <w:noProof/>
+        </w:rPr>
+        <w:drawing>
+          <wp:inline distT="0" distB="0" distL="0" distR="0" wp14:anchorId="0486A574" wp14:editId="0D8F0102">
+            <wp:extent cx="5943600" cy="2795270"/>
+            <wp:effectExtent l="0" t="0" r="0" b="5080"/>
+            <wp:docPr id="1578182138" name="Picture 7" descr="A graph of different colored lines&#10;&#10;AI-generated content may be incorrect."/>
+            <wp:cNvGraphicFramePr>
+              <a:graphicFrameLocks xmlns:a="http://schemas.openxmlformats.org/drawingml/2006/main" noChangeAspect="1"/>
+            </wp:cNvGraphicFramePr>
+            <a:graphic xmlns:a="http://schemas.openxmlformats.org/drawingml/2006/main">
+              <a:graphicData uri="http://schemas.openxmlformats.org/drawingml/2006/picture">
+                <pic:pic xmlns:pic="http://schemas.openxmlformats.org/drawingml/2006/picture">
+                  <pic:nvPicPr>
+                    <pic:cNvPr id="1578182138" name="Picture 7" descr="A graph of different colored lines&#10;&#10;AI-generated content may be incorrect."/>
+                    <pic:cNvPicPr>
+                      <a:picLocks noChangeAspect="1" noChangeArrowheads="1"/>
+                    </pic:cNvPicPr>
+                  </pic:nvPicPr>
+                  <pic:blipFill>
+                    <a:blip r:embed="rId13">
+                      <a:extLst>
+                        <a:ext uri="{28A0092B-C50C-407E-A947-70E740481C1C}">
+                          <a14:useLocalDpi xmlns:a14="http://schemas.microsoft.com/office/drawing/2010/main" val="0"/>
+                        </a:ext>
+                      </a:extLst>
+                    </a:blip>
+                    <a:srcRect/>
+                    <a:stretch>
+                      <a:fillRect/>
+                    </a:stretch>
+                  </pic:blipFill>
+                  <pic:spPr bwMode="auto">
+                    <a:xfrm>
+                      <a:off x="0" y="0"/>
+                      <a:ext cx="5943600" cy="2795270"/>
+                    </a:xfrm>
+                    <a:prstGeom prst="rect">
+                      <a:avLst/>
+                    </a:prstGeom>
+                    <a:noFill/>
+                    <a:ln>
+                      <a:noFill/>
+                    </a:ln>
+                  </pic:spPr>
+                </pic:pic>
+              </a:graphicData>
+            </a:graphic>
+          </wp:inline>
+        </w:drawing>
+      </w:r>
+    </w:p>
+    <w:p/>
+    <w:p>
       <w:pPr>
         <w:rPr>
           <w:u w:val="single"/>
@@ -562,7 +750,7 @@
       </w:r>
     </w:p>
     <w:sectPr>
-      <w:headerReference w:type="default" r:id="rId12"/>
+      <w:headerReference w:type="default" r:id="rId14"/>
       <w:pgSz w:w="12240" w:h="15840"/>
       <w:pgMar w:top="1440" w:right="1440" w:bottom="1440" w:left="1440" w:header="720" w:footer="720" w:gutter="0"/>
       <w:cols w:space="720"/>

</xml_diff>